<commit_message>
Zwischen Stand Sprint 3 - Beginn der Chapter und Post allgemein Design frischer mit gsap
</commit_message>
<xml_diff>
--- a/documentation/Sprint 3.docx
+++ b/documentation/Sprint 3.docx
@@ -3,6 +3,9 @@
 <w:document xmlns:wpc="http://schemas.microsoft.com/office/word/2010/wordprocessingCanvas" xmlns:cx="http://schemas.microsoft.com/office/drawing/2014/chartex" xmlns:mc="http://schemas.openxmlformats.org/markup-compatibility/2006" xmlns:o="urn:schemas-microsoft-com:office:office" xmlns:r="http://schemas.openxmlformats.org/officeDocument/2006/relationships" xmlns:m="http://schemas.openxmlformats.org/officeDocument/2006/math" xmlns:v="urn:schemas-microsoft-com:vml" xmlns:wp14="http://schemas.microsoft.com/office/word/2010/wordprocessingDrawing" xmlns:wp="http://schemas.openxmlformats.org/drawingml/2006/wordprocessingDrawing" xmlns:w10="urn:schemas-microsoft-com:office:word" xmlns:w="http://schemas.openxmlformats.org/wordprocessingml/2006/main" xmlns:w14="http://schemas.microsoft.com/office/word/2010/wordml" xmlns:w15="http://schemas.microsoft.com/office/word/2012/wordml" xmlns:w16se="http://schemas.microsoft.com/office/word/2015/wordml/symex" xmlns:wpg="http://schemas.microsoft.com/office/word/2010/wordprocessingGroup" xmlns:wpi="http://schemas.microsoft.com/office/word/2010/wordprocessingInk" xmlns:wne="http://schemas.microsoft.com/office/word/2006/wordml" xmlns:wps="http://schemas.microsoft.com/office/word/2010/wordprocessingShape" mc:Ignorable="w14 w15 w16se wp14">
   <w:body>
     <w:p>
+      <w:pPr>
+        <w:pStyle w:val="Titel"/>
+      </w:pPr>
       <w:r>
         <w:t xml:space="preserve">Sprint 3 – Dokumentation – </w:t>
       </w:r>
@@ -14,17 +17,29 @@
     </w:p>
     <w:p/>
     <w:p>
+      <w:pPr>
+        <w:pStyle w:val="berschrift1"/>
+      </w:pPr>
       <w:r>
         <w:t>Ziele für diesen Sprint:</w:t>
       </w:r>
     </w:p>
     <w:p>
-      <w:proofErr w:type="spellStart"/>
-      <w:r>
-        <w:t>Allgmeines</w:t>
-      </w:r>
-      <w:proofErr w:type="spellEnd"/>
-      <w:r>
+      <w:pPr>
+        <w:rPr>
+          <w:b/>
+        </w:rPr>
+      </w:pPr>
+      <w:r>
+        <w:rPr>
+          <w:b/>
+        </w:rPr>
+        <w:t>Allgemeines</w:t>
+      </w:r>
+      <w:r>
+        <w:rPr>
+          <w:b/>
+        </w:rPr>
         <w:t>:</w:t>
       </w:r>
     </w:p>
@@ -35,7 +50,12 @@
     </w:p>
     <w:p>
       <w:r>
-        <w:t>Bewertung bei Mangas speichern (</w:t>
+        <w:t>Bewertung bei Manga</w:t>
+      </w:r>
+      <w:bookmarkStart w:id="0" w:name="_GoBack"/>
+      <w:bookmarkEnd w:id="0"/>
+      <w:r>
+        <w:t>s speichern (</w:t>
       </w:r>
       <w:proofErr w:type="spellStart"/>
       <w:r>
@@ -55,11 +75,9 @@
       </w:r>
     </w:p>
     <w:p>
-      <w:proofErr w:type="spellStart"/>
-      <w:r>
-        <w:t>Bewertungs</w:t>
-      </w:r>
-      <w:proofErr w:type="spellEnd"/>
+      <w:r>
+        <w:t>Bewertung</w:t>
+      </w:r>
       <w:r>
         <w:t xml:space="preserve"> Tabelle auslegen und mit Manga und User verbinden (</w:t>
       </w:r>
@@ -80,12 +98,16 @@
           <w:numId w:val="1"/>
         </w:numPr>
       </w:pPr>
-      <w:proofErr w:type="gramStart"/>
-      <w:r>
-        <w:t>Bewertung(</w:t>
-      </w:r>
-      <w:proofErr w:type="spellStart"/>
-      <w:proofErr w:type="gramEnd"/>
+      <w:r>
+        <w:t>Bewertung</w:t>
+      </w:r>
+      <w:r>
+        <w:t xml:space="preserve"> </w:t>
+      </w:r>
+      <w:r>
+        <w:t>(</w:t>
+      </w:r>
+      <w:proofErr w:type="spellStart"/>
       <w:r>
         <w:rPr>
           <w:u w:val="single"/>
@@ -118,12 +140,23 @@
     </w:p>
     <w:p/>
     <w:p>
-      <w:proofErr w:type="spellStart"/>
-      <w:r>
+      <w:pPr>
+        <w:rPr>
+          <w:b/>
+        </w:rPr>
+      </w:pPr>
+      <w:proofErr w:type="spellStart"/>
+      <w:r>
+        <w:rPr>
+          <w:b/>
+        </w:rPr>
         <w:t>Index.php</w:t>
       </w:r>
       <w:proofErr w:type="spellEnd"/>
       <w:r>
+        <w:rPr>
+          <w:b/>
+        </w:rPr>
         <w:t>:</w:t>
       </w:r>
     </w:p>
@@ -142,11 +175,25 @@
     </w:p>
     <w:p/>
     <w:p>
-      <w:proofErr w:type="spellStart"/>
-      <w:r>
+      <w:pPr>
+        <w:rPr>
+          <w:b/>
+        </w:rPr>
+      </w:pPr>
+      <w:proofErr w:type="spellStart"/>
+      <w:r>
+        <w:rPr>
+          <w:b/>
+        </w:rPr>
         <w:t>Kommentar.php</w:t>
       </w:r>
       <w:proofErr w:type="spellEnd"/>
+      <w:r>
+        <w:rPr>
+          <w:b/>
+        </w:rPr>
+        <w:t>:</w:t>
+      </w:r>
     </w:p>
     <w:p>
       <w:r>
@@ -158,101 +205,111 @@
         <w:t>Comment Tabelle einbauen</w:t>
       </w:r>
     </w:p>
+    <w:p>
+      <w:r>
+        <w:t xml:space="preserve">Verbindung zu Chapter und </w:t>
+      </w:r>
+      <w:proofErr w:type="spellStart"/>
+      <w:r>
+        <w:t>user</w:t>
+      </w:r>
+      <w:proofErr w:type="spellEnd"/>
+      <w:r>
+        <w:t xml:space="preserve"> aufsetzten </w:t>
+      </w:r>
+    </w:p>
     <w:p/>
     <w:p>
-      <w:r>
-        <w:t xml:space="preserve">Verbindung zu Chapter und </w:t>
-      </w:r>
-      <w:proofErr w:type="spellStart"/>
-      <w:r>
-        <w:t>user</w:t>
-      </w:r>
-      <w:proofErr w:type="spellEnd"/>
-      <w:r>
-        <w:t xml:space="preserve"> aufsetzten </w:t>
+      <w:pPr>
+        <w:rPr>
+          <w:b/>
+        </w:rPr>
+      </w:pPr>
+      <w:proofErr w:type="spellStart"/>
+      <w:r>
+        <w:rPr>
+          <w:b/>
+        </w:rPr>
+        <w:t>Profil.php</w:t>
+      </w:r>
+      <w:proofErr w:type="spellEnd"/>
+      <w:r>
+        <w:rPr>
+          <w:b/>
+        </w:rPr>
+        <w:t>:</w:t>
+      </w:r>
+    </w:p>
+    <w:p>
+      <w:proofErr w:type="spellStart"/>
+      <w:r>
+        <w:t>FavManga</w:t>
+      </w:r>
+      <w:proofErr w:type="spellEnd"/>
+      <w:r>
+        <w:t xml:space="preserve"> </w:t>
+      </w:r>
+      <w:r>
+        <w:t>Ausgabe</w:t>
+      </w:r>
+      <w:r>
+        <w:t xml:space="preserve"> verschönern</w:t>
       </w:r>
     </w:p>
     <w:p/>
     <w:p>
-      <w:proofErr w:type="spellStart"/>
-      <w:r>
-        <w:t>Profil.php</w:t>
+      <w:pPr>
+        <w:pStyle w:val="berschrift1"/>
+      </w:pPr>
+      <w:r>
+        <w:t>Erreicht:</w:t>
+      </w:r>
+    </w:p>
+    <w:p>
+      <w:proofErr w:type="spellStart"/>
+      <w:r>
+        <w:t>Index.php</w:t>
+      </w:r>
+      <w:proofErr w:type="spellEnd"/>
+      <w:r>
+        <w:t xml:space="preserve"> </w:t>
+      </w:r>
+      <w:proofErr w:type="spellStart"/>
+      <w:r>
+        <w:t>änderung</w:t>
+      </w:r>
+      <w:proofErr w:type="spellEnd"/>
+      <w:r>
+        <w:t xml:space="preserve"> falls Manga schon als </w:t>
+      </w:r>
+      <w:proofErr w:type="spellStart"/>
+      <w:r>
+        <w:t>Fav</w:t>
+      </w:r>
+      <w:proofErr w:type="spellEnd"/>
+      <w:r>
+        <w:t xml:space="preserve"> gilt eingebaut.</w:t>
+      </w:r>
+    </w:p>
+    <w:p>
+      <w:pPr>
+        <w:pStyle w:val="berschrift1"/>
+      </w:pPr>
+      <w:r>
+        <w:t>Ziele für den nächsten Sprint:</w:t>
+      </w:r>
+    </w:p>
+    <w:p/>
+    <w:p>
+      <w:proofErr w:type="spellStart"/>
+      <w:r>
+        <w:t>myInteraction.php</w:t>
       </w:r>
       <w:proofErr w:type="spellEnd"/>
       <w:r>
         <w:t>:</w:t>
       </w:r>
     </w:p>
-    <w:p>
-      <w:proofErr w:type="spellStart"/>
-      <w:r>
-        <w:t>FavManga</w:t>
-      </w:r>
-      <w:proofErr w:type="spellEnd"/>
-      <w:r>
-        <w:t xml:space="preserve"> </w:t>
-      </w:r>
-      <w:r>
-        <w:t>Ausgabe</w:t>
-      </w:r>
-      <w:r>
-        <w:t xml:space="preserve"> verschönern</w:t>
-      </w:r>
-    </w:p>
-    <w:p/>
-    <w:p/>
-    <w:p/>
-    <w:p>
-      <w:r>
-        <w:t>Erreicht:</w:t>
-      </w:r>
-    </w:p>
-    <w:p>
-      <w:proofErr w:type="spellStart"/>
-      <w:r>
-        <w:t>Index.php</w:t>
-      </w:r>
-      <w:proofErr w:type="spellEnd"/>
-      <w:r>
-        <w:t xml:space="preserve"> </w:t>
-      </w:r>
-      <w:proofErr w:type="spellStart"/>
-      <w:r>
-        <w:t>änderung</w:t>
-      </w:r>
-      <w:proofErr w:type="spellEnd"/>
-      <w:r>
-        <w:t xml:space="preserve"> falls Manga schon als </w:t>
-      </w:r>
-      <w:proofErr w:type="spellStart"/>
-      <w:r>
-        <w:t>Fav</w:t>
-      </w:r>
-      <w:proofErr w:type="spellEnd"/>
-      <w:r>
-        <w:t xml:space="preserve"> gilt eingebaut.</w:t>
-      </w:r>
-      <w:bookmarkStart w:id="0" w:name="_GoBack"/>
-      <w:bookmarkEnd w:id="0"/>
-    </w:p>
-    <w:p/>
-    <w:p>
-      <w:r>
-        <w:t>Ziele für den nächsten Sprint:</w:t>
-      </w:r>
-    </w:p>
-    <w:p/>
-    <w:p>
-      <w:proofErr w:type="spellStart"/>
-      <w:r>
-        <w:t>myInteraction.php</w:t>
-      </w:r>
-      <w:proofErr w:type="spellEnd"/>
-      <w:r>
-        <w:t>:</w:t>
-      </w:r>
-    </w:p>
-    <w:p/>
     <w:p>
       <w:r>
         <w:t xml:space="preserve">Interaction Tabelle jene speichert: </w:t>
@@ -809,6 +866,27 @@
     <w:name w:val="Normal"/>
     <w:qFormat/>
   </w:style>
+  <w:style w:type="paragraph" w:styleId="berschrift1">
+    <w:name w:val="heading 1"/>
+    <w:basedOn w:val="Standard"/>
+    <w:next w:val="Standard"/>
+    <w:link w:val="berschrift1Zchn"/>
+    <w:uiPriority w:val="9"/>
+    <w:qFormat/>
+    <w:rsid w:val="00462D14"/>
+    <w:pPr>
+      <w:keepNext/>
+      <w:keepLines/>
+      <w:spacing w:before="240" w:after="0"/>
+      <w:outlineLvl w:val="0"/>
+    </w:pPr>
+    <w:rPr>
+      <w:rFonts w:asciiTheme="majorHAnsi" w:eastAsiaTheme="majorEastAsia" w:hAnsiTheme="majorHAnsi" w:cstheme="majorBidi"/>
+      <w:color w:val="2E74B5" w:themeColor="accent1" w:themeShade="BF"/>
+      <w:sz w:val="32"/>
+      <w:szCs w:val="32"/>
+    </w:rPr>
+  </w:style>
   <w:style w:type="character" w:default="1" w:styleId="Absatz-Standardschriftart">
     <w:name w:val="Default Paragraph Font"/>
     <w:uiPriority w:val="1"/>
@@ -846,6 +924,53 @@
       <w:ind w:left="720"/>
       <w:contextualSpacing/>
     </w:pPr>
+  </w:style>
+  <w:style w:type="paragraph" w:styleId="Titel">
+    <w:name w:val="Title"/>
+    <w:basedOn w:val="Standard"/>
+    <w:next w:val="Standard"/>
+    <w:link w:val="TitelZchn"/>
+    <w:uiPriority w:val="10"/>
+    <w:qFormat/>
+    <w:rsid w:val="00462D14"/>
+    <w:pPr>
+      <w:spacing w:after="0" w:line="240" w:lineRule="auto"/>
+      <w:contextualSpacing/>
+    </w:pPr>
+    <w:rPr>
+      <w:rFonts w:asciiTheme="majorHAnsi" w:eastAsiaTheme="majorEastAsia" w:hAnsiTheme="majorHAnsi" w:cstheme="majorBidi"/>
+      <w:spacing w:val="-10"/>
+      <w:kern w:val="28"/>
+      <w:sz w:val="56"/>
+      <w:szCs w:val="56"/>
+    </w:rPr>
+  </w:style>
+  <w:style w:type="character" w:customStyle="1" w:styleId="TitelZchn">
+    <w:name w:val="Titel Zchn"/>
+    <w:basedOn w:val="Absatz-Standardschriftart"/>
+    <w:link w:val="Titel"/>
+    <w:uiPriority w:val="10"/>
+    <w:rsid w:val="00462D14"/>
+    <w:rPr>
+      <w:rFonts w:asciiTheme="majorHAnsi" w:eastAsiaTheme="majorEastAsia" w:hAnsiTheme="majorHAnsi" w:cstheme="majorBidi"/>
+      <w:spacing w:val="-10"/>
+      <w:kern w:val="28"/>
+      <w:sz w:val="56"/>
+      <w:szCs w:val="56"/>
+    </w:rPr>
+  </w:style>
+  <w:style w:type="character" w:customStyle="1" w:styleId="berschrift1Zchn">
+    <w:name w:val="Überschrift 1 Zchn"/>
+    <w:basedOn w:val="Absatz-Standardschriftart"/>
+    <w:link w:val="berschrift1"/>
+    <w:uiPriority w:val="9"/>
+    <w:rsid w:val="00462D14"/>
+    <w:rPr>
+      <w:rFonts w:asciiTheme="majorHAnsi" w:eastAsiaTheme="majorEastAsia" w:hAnsiTheme="majorHAnsi" w:cstheme="majorBidi"/>
+      <w:color w:val="2E74B5" w:themeColor="accent1" w:themeShade="BF"/>
+      <w:sz w:val="32"/>
+      <w:szCs w:val="32"/>
+    </w:rPr>
   </w:style>
 </w:styles>
 </file>

</xml_diff>

<commit_message>
Ende Sprint 3 Beginn Sprint 4
</commit_message>
<xml_diff>
--- a/documentation/Sprint 3.docx
+++ b/documentation/Sprint 3.docx
@@ -45,17 +45,15 @@
     </w:p>
     <w:p>
       <w:r>
-        <w:t>Bilder für die Mangas besorgen + speichern (Bilder Tabelle)</w:t>
-      </w:r>
-    </w:p>
-    <w:p>
-      <w:r>
-        <w:t>Bewertung bei Manga</w:t>
-      </w:r>
-      <w:bookmarkStart w:id="0" w:name="_GoBack"/>
-      <w:bookmarkEnd w:id="0"/>
-      <w:r>
-        <w:t>s speichern (</w:t>
+        <w:t>Bilder für d</w:t>
+      </w:r>
+      <w:r>
+        <w:t xml:space="preserve">ie Mangas besorgen + speichern </w:t>
+      </w:r>
+    </w:p>
+    <w:p>
+      <w:r>
+        <w:t>Bewertung bei Mangas speichern (</w:t>
       </w:r>
       <w:proofErr w:type="spellStart"/>
       <w:r>
@@ -264,6 +262,8 @@
       <w:r>
         <w:t>Erreicht:</w:t>
       </w:r>
+      <w:bookmarkStart w:id="0" w:name="_GoBack"/>
+      <w:bookmarkEnd w:id="0"/>
     </w:p>
     <w:p>
       <w:proofErr w:type="spellStart"/>
@@ -289,6 +289,11 @@
       <w:proofErr w:type="spellEnd"/>
       <w:r>
         <w:t xml:space="preserve"> gilt eingebaut.</w:t>
+      </w:r>
+    </w:p>
+    <w:p>
+      <w:r>
+        <w:t>Bilder für Mangas besorgen.</w:t>
       </w:r>
     </w:p>
     <w:p>

</xml_diff>